<commit_message>
Mettre à jour la note méthodologique salaire/expérience
</commit_message>
<xml_diff>
--- a/Note_methodologique_salaire_experience.docx
+++ b/Note_methodologique_salaire_experience.docx
@@ -957,16 +957,8 @@
             <w:shd w:fill="F6F8FA"/>
           </w:tcPr>
           <w:p>
-            <w:pPr>
-              <w:spacing w:after="0" w:line="252" w:lineRule="auto"/>
-            </w:pPr>
             <w:r>
-              <w:rPr>
-                <w:rFonts w:ascii="Liberation Sans" w:hAnsi="Liberation Sans"/>
-                <w:b w:val="0"/>
-                <w:sz w:val="17"/>
-              </w:rPr>
-              <w:t>Montant brut total de la feuille 1, tous codes postes confondus.</w:t>
+              <w:t>Brut total de la feuille 1, après correction 07a, moins les postes F2 461, 462, 463 et 464 (représentation).</w:t>
             </w:r>
           </w:p>
         </w:tc>
@@ -1013,7 +1005,7 @@
     </w:p>
     <w:p>
       <w:r>
-        <w:t>Les populations M1 et M2 peuvent être différentes : chacune est filtrée selon son propre statut de conformité. Les montants sont mensuels, en FCFA. Le panel compte une ligne par matricule et mois après regroupement des postes.</w:t>
+        <w:t>Les populations M1 et M2 peuvent être différentes : chacune est filtrée selon son propre statut de conformité. Les montants sont mensuels, en FCFA. Le panel compte une ligne par matricule et mois après regroupement des postes. Pour M2, le filtre Statut_Total reste calculé en amont sur le brut avant cette déduction. Lorsqu’un brut a été imputé par 07a, les postes déduits restent ceux du mois observé.</w:t>
       </w:r>
     </w:p>
     <w:p>

</xml_diff>